<commit_message>
Add Durable AI Agent Workflow Platform to projects and resume
Adds the durable AI agent workflow platform as the lead project on the portfolio
site and a new entry in the resume (PROJECTS section), linking to the GitHub repo.

Co-Authored-By: Claude Opus 4.8 <noreply@anthropic.com>
</commit_message>
<xml_diff>
--- a/assets/Himadri_S_Chatterjee_Resume.docx
+++ b/assets/Himadri_S_Chatterjee_Resume.docx
@@ -331,16 +331,7 @@
           <w:sz w:val="20"/>
           <w:szCs w:val="20"/>
         </w:rPr>
-        <w:t xml:space="preserve">  —  Convai, Bangalore</w:t>
-      </w:r>
-      <w:r>
-        <w:rPr>
-          <w:rFonts w:ascii="Arial" w:cs="Arial" w:eastAsia="Arial" w:hAnsi="Arial"/>
-          <w:color w:val="555555"/>
-          <w:sz w:val="20"/>
-          <w:szCs w:val="20"/>
-        </w:rPr>
-        <w:t xml:space="preserve">	Mar 2022 – Present</w:t>
+        <w:t xml:space="preserve">  —  Convai, Bangalore	Mar 2022 – Present</w:t>
       </w:r>
     </w:p>
     <w:p>
@@ -562,16 +553,7 @@
           <w:sz w:val="20"/>
           <w:szCs w:val="20"/>
         </w:rPr>
-        <w:t xml:space="preserve">  —  Tata Consultancy Services, Bangalore</w:t>
-      </w:r>
-      <w:r>
-        <w:rPr>
-          <w:rFonts w:ascii="Arial" w:cs="Arial" w:eastAsia="Arial" w:hAnsi="Arial"/>
-          <w:color w:val="555555"/>
-          <w:sz w:val="20"/>
-          <w:szCs w:val="20"/>
-        </w:rPr>
-        <w:t xml:space="preserve">	May 2021 – Mar 2022</w:t>
+        <w:t xml:space="preserve">  —  Tata Consultancy Services, Bangalore	May 2021 – Mar 2022</w:t>
       </w:r>
     </w:p>
     <w:p>
@@ -637,16 +619,7 @@
           <w:sz w:val="20"/>
           <w:szCs w:val="20"/>
         </w:rPr>
-        <w:t xml:space="preserve">  —  BNP Paribas, Mumbai</w:t>
-      </w:r>
-      <w:r>
-        <w:rPr>
-          <w:rFonts w:ascii="Arial" w:cs="Arial" w:eastAsia="Arial" w:hAnsi="Arial"/>
-          <w:color w:val="555555"/>
-          <w:sz w:val="20"/>
-          <w:szCs w:val="20"/>
-        </w:rPr>
-        <w:t xml:space="preserve">	Jan 2021 – Mar 2021</w:t>
+        <w:t xml:space="preserve">  —  BNP Paribas, Mumbai	Jan 2021 – Mar 2021</w:t>
       </w:r>
     </w:p>
     <w:p>
@@ -686,6 +659,136 @@
           <w:szCs w:val="22"/>
         </w:rPr>
         <w:t xml:space="preserve">PROJECTS</w:t>
+      </w:r>
+    </w:p>
+    <w:p>
+      <w:pPr>
+        <w:spacing w:after="40" w:before="160"/>
+      </w:pPr>
+      <w:r>
+        <w:rPr>
+          <w:rFonts w:ascii="Arial" w:cs="Arial" w:eastAsia="Arial" w:hAnsi="Arial"/>
+          <w:b/>
+          <w:bCs/>
+          <w:color w:val="1A1A1A"/>
+          <w:sz w:val="21"/>
+          <w:szCs w:val="21"/>
+        </w:rPr>
+        <w:t xml:space="preserve">Durable AI Agent Workflow Platform — Effectively-Once Execution Engine</w:t>
+      </w:r>
+      <w:r>
+        <w:rPr>
+          <w:rFonts w:ascii="Arial" w:cs="Arial" w:eastAsia="Arial" w:hAnsi="Arial"/>
+          <w:color w:val="555555"/>
+          <w:sz w:val="20"/>
+          <w:szCs w:val="20"/>
+        </w:rPr>
+        <w:t xml:space="preserve">  |  </w:t>
+      </w:r>
+      <w:hyperlink w:history="1" r:id="rIdawpworkflow001">
+        <w:r>
+          <w:rPr>
+            <w:rFonts w:ascii="Arial" w:cs="Arial" w:eastAsia="Arial" w:hAnsi="Arial"/>
+            <w:color w:val="2B547E"/>
+            <w:sz w:val="20"/>
+            <w:szCs w:val="20"/>
+            <w:u w:val="single"/>
+          </w:rPr>
+          <w:t xml:space="preserve">GitHub</w:t>
+        </w:r>
+      </w:hyperlink>
+    </w:p>
+    <w:p>
+      <w:pPr>
+        <w:spacing w:after="20" w:before="20"/>
+      </w:pPr>
+      <w:r>
+        <w:rPr>
+          <w:rFonts w:ascii="Arial" w:cs="Arial" w:eastAsia="Arial" w:hAnsi="Arial"/>
+          <w:i/>
+          <w:iCs/>
+          <w:color w:val="555555"/>
+          <w:sz w:val="18"/>
+          <w:szCs w:val="18"/>
+        </w:rPr>
+        <w:t xml:space="preserve">Python, FastAPI, Celery, Postgres, Redis, OpenTelemetry, Jaeger, Next.js, Docker</w:t>
+      </w:r>
+    </w:p>
+    <w:p>
+      <w:pPr>
+        <w:pStyle w:val="ListParagraph"/>
+        <w:numPr>
+          <w:ilvl w:val="0"/>
+          <w:numId w:val="3"/>
+        </w:numPr>
+        <w:spacing w:after="40" w:before="40"/>
+      </w:pPr>
+      <w:r>
+        <w:rPr>
+          <w:rFonts w:ascii="Arial" w:cs="Arial" w:eastAsia="Arial" w:hAnsi="Arial"/>
+          <w:color w:val="1A1A1A"/>
+          <w:sz w:val="20"/>
+          <w:szCs w:val="20"/>
+        </w:rPr>
+        <w:t xml:space="preserve">Built a production-style platform that runs AI tasks as durable workflows on FastAPI, Celery, Postgres, and Redis, with Postgres as the source of truth and the queue only scheduling work.</w:t>
+      </w:r>
+    </w:p>
+    <w:p>
+      <w:pPr>
+        <w:pStyle w:val="ListParagraph"/>
+        <w:numPr>
+          <w:ilvl w:val="0"/>
+          <w:numId w:val="3"/>
+        </w:numPr>
+        <w:spacing w:after="40" w:before="40"/>
+      </w:pPr>
+      <w:r>
+        <w:rPr>
+          <w:rFonts w:ascii="Arial" w:cs="Arial" w:eastAsia="Arial" w:hAnsi="Arial"/>
+          <w:color w:val="1A1A1A"/>
+          <w:sz w:val="20"/>
+          <w:szCs w:val="20"/>
+        </w:rPr>
+        <w:t xml:space="preserve">Hand-built the durable execution engine: commit-before-execute steps, retry with exponential backoff, idempotency keys for </w:t>
+      </w:r>
+      <w:r>
+        <w:rPr>
+          <w:rFonts w:ascii="Arial" w:cs="Arial" w:eastAsia="Arial" w:hAnsi="Arial"/>
+          <w:b/>
+          <w:bCs/>
+          <w:color w:val="1A1A1A"/>
+          <w:sz w:val="20"/>
+          <w:szCs w:val="20"/>
+        </w:rPr>
+        <w:t xml:space="preserve">effectively-once</w:t>
+      </w:r>
+      <w:r>
+        <w:rPr>
+          <w:rFonts w:ascii="Arial" w:cs="Arial" w:eastAsia="Arial" w:hAnsi="Arial"/>
+          <w:color w:val="1A1A1A"/>
+          <w:sz w:val="20"/>
+          <w:szCs w:val="20"/>
+        </w:rPr>
+        <w:t xml:space="preserve"> side effects, and a periodic sweeper that resumes runs stranded by a worker crash.</w:t>
+      </w:r>
+    </w:p>
+    <w:p>
+      <w:pPr>
+        <w:pStyle w:val="ListParagraph"/>
+        <w:numPr>
+          <w:ilvl w:val="0"/>
+          <w:numId w:val="3"/>
+        </w:numPr>
+        <w:spacing w:after="40" w:before="40"/>
+      </w:pPr>
+      <w:r>
+        <w:rPr>
+          <w:rFonts w:ascii="Arial" w:cs="Arial" w:eastAsia="Arial" w:hAnsi="Arial"/>
+          <w:color w:val="1A1A1A"/>
+          <w:sz w:val="20"/>
+          <w:szCs w:val="20"/>
+        </w:rPr>
+        <w:t xml:space="preserve">Added human-in-the-loop approval gates with an audit trail, OpenTelemetry distributed tracing to Jaeger, a cost/latency metrics dashboard, and an automated eval harness scoring runs across six quality and cost dimensions.</w:t>
       </w:r>
     </w:p>
     <w:p>
@@ -1063,16 +1166,7 @@
           <w:sz w:val="20"/>
           <w:szCs w:val="20"/>
         </w:rPr>
-        <w:t xml:space="preserve">  —  Vellore Institute of Technology, Vellore</w:t>
-      </w:r>
-      <w:r>
-        <w:rPr>
-          <w:rFonts w:ascii="Arial" w:cs="Arial" w:eastAsia="Arial" w:hAnsi="Arial"/>
-          <w:color w:val="555555"/>
-          <w:sz w:val="20"/>
-          <w:szCs w:val="20"/>
-        </w:rPr>
-        <w:t xml:space="preserve">	2019 – 2021</w:t>
+        <w:t xml:space="preserve">  —  Vellore Institute of Technology, Vellore	2019 – 2021</w:t>
       </w:r>
     </w:p>
     <w:p>
@@ -1100,16 +1194,7 @@
           <w:sz w:val="20"/>
           <w:szCs w:val="20"/>
         </w:rPr>
-        <w:t xml:space="preserve">  —  RKMRC, Kolkata</w:t>
-      </w:r>
-      <w:r>
-        <w:rPr>
-          <w:rFonts w:ascii="Arial" w:cs="Arial" w:eastAsia="Arial" w:hAnsi="Arial"/>
-          <w:color w:val="555555"/>
-          <w:sz w:val="20"/>
-          <w:szCs w:val="20"/>
-        </w:rPr>
-        <w:t xml:space="preserve">	2016 – 2019</w:t>
+        <w:t xml:space="preserve">  —  RKMRC, Kolkata	2016 – 2019</w:t>
       </w:r>
     </w:p>
     <w:p>

</xml_diff>

<commit_message>
Add Work Buddy to resume; ship PDF resume and link to it
- Update the resume (docx) capstone project: the placeholder multi-agent
  entry is now Work Buddy - ADK workstream control agent, with accurate
  bullets, tech stack, and a link to the GitHub repo.
- Add a generated PDF resume and point the site's resume download at it
  (was linking the .docx).

Co-Authored-By: Claude Opus 4.8 <noreply@anthropic.com>
</commit_message>
<xml_diff>
--- a/assets/Himadri_S_Chatterjee_Resume.docx
+++ b/assets/Himadri_S_Chatterjee_Resume.docx
@@ -1024,7 +1024,7 @@
           <w:sz w:val="21"/>
           <w:szCs w:val="21"/>
         </w:rPr>
-        <w:t xml:space="preserve">Multi-Agent Orchestration System — Google/Kaggle AI Agents Intensive Capstone</w:t>
+        <w:t xml:space="preserve">Work Buddy — Workstream Control Agent (AI Agents Intensive Capstone)</w:t>
       </w:r>
       <w:r>
         <w:rPr>
@@ -1044,7 +1044,7 @@
             <w:szCs w:val="20"/>
             <w:u w:val="single"/>
           </w:rPr>
-          <w:t xml:space="preserve">Kaggle</w:t>
+          <w:t xml:space="preserve">GitHub</w:t>
         </w:r>
       </w:hyperlink>
     </w:p>
@@ -1061,7 +1061,7 @@
           <w:sz w:val="18"/>
           <w:szCs w:val="18"/>
         </w:rPr>
-        <w:t xml:space="preserve">Python, Gemini API, Tool-Use, Agent-to-Agent Communication, Memory Engineering, Guardrails</w:t>
+        <w:t xml:space="preserve">Python, Google ADK, Multi-Agent Orchestration, MCP, Gemini / Vertex, FastAPI</w:t>
       </w:r>
     </w:p>
     <w:p>
@@ -1080,7 +1080,7 @@
           <w:sz w:val="20"/>
           <w:szCs w:val="20"/>
         </w:rPr>
-        <w:t xml:space="preserve">Built a multi-agent system as the capstone for Google’s 5-Day AI Agents Intensive (Kaggle-certified): specialized agents (researcher, coder, reviewer) collaborate via a central orchestrator that manages tool delegation, context passing, and conflict resolution.</w:t>
+        <w:t xml:space="preserve">Built Work Buddy, a multi-agent system on Google’s Agent Development Kit (ADK) that turns messy project context—meeting notes, Slack, email, Jira, and repo state—into an auditable execution ledger; a coordinator delegates to five specialist sub-agents for ingestion, cross-source reconciliation, and drafting.</w:t>
       </w:r>
     </w:p>
     <w:p>
@@ -1099,7 +1099,7 @@
           <w:sz w:val="20"/>
           <w:szCs w:val="20"/>
         </w:rPr>
-        <w:t xml:space="preserve">Implemented long-term agent memory, structured output parsing, retry logic with fallback models, and safety guardrails; integrated external APIs for real-world task execution beyond simple text generation.</w:t>
+        <w:t xml:space="preserve">Enforced a human-in-the-loop approval gate before any external write (Jira, Slack, email, GitHub PR), with secret redaction and source-evidence tracking, so the agent never claims work is done, merged, or shipped without tool proof.</w:t>
       </w:r>
     </w:p>
     <w:p>
@@ -1118,7 +1118,7 @@
           <w:sz w:val="20"/>
           <w:szCs w:val="20"/>
         </w:rPr>
-        <w:t xml:space="preserve">Evaluated single-agent vs. multi-agent task completion accuracy and latency; documented architectural tradeoffs in agent decomposition and context window management.</w:t>
+        <w:t xml:space="preserve">Exposed the full tool set over a Model Context Protocol (MCP) server, added an eval suite covering the safety-sensitive behavior, and shipped a FastAPI dashboard with a Cloud Run deployment path; model-agnostic via Gemini/Vertex with OpenAI, Claude, and Ollama fallbacks.</w:t>
       </w:r>
     </w:p>
     <w:p>

</xml_diff>

<commit_message>
Resume: replace CUDA kernels project with published crowd-video analysis
- Swap the Custom CUDA Kernels project for the Violent Crowd Behaviour
  Detection (C3D / ViolentFlow, published) project, with GitHub link.
- Remove remaining CUDA claims from the summary and skills for consistency.
- Regenerate the PDF.

Co-Authored-By: Claude Opus 4.8 <noreply@anthropic.com>
</commit_message>
<xml_diff>
--- a/assets/Himadri_S_Chatterjee_Resume.docx
+++ b/assets/Himadri_S_Chatterjee_Resume.docx
@@ -138,7 +138,7 @@
           <w:sz w:val="20"/>
           <w:szCs w:val="20"/>
         </w:rPr>
-        <w:t xml:space="preserve">Founding Software Engineer with 4+ years of experience building and scaling production AI platforms, real-time streaming services, and payment infrastructure on GCP. Deep hands-on understanding of the transformer stack—from custom CUDA kernels and model training to multi-agent orchestration and cloud deployment. Track record of shipping product in fast-moving startup environments, working cross-functionally with ML, product, and design teams.</w:t>
+        <w:t xml:space="preserve">Founding Software Engineer with 4+ years of experience building and scaling production AI platforms, real-time streaming services, and payment infrastructure on GCP. Deep hands-on understanding of the transformer stack—from model training and fine-tuning to multi-agent orchestration and cloud deployment. Track record of shipping product in fast-moving startup environments, working cross-functionally with ML, product, and design teams.</w:t>
       </w:r>
     </w:p>
     <w:p>
@@ -183,7 +183,7 @@
           <w:sz w:val="20"/>
           <w:szCs w:val="20"/>
         </w:rPr>
-        <w:t xml:space="preserve">Python, Go, C, C++/CUDA, SQL, JavaScript</w:t>
+        <w:t xml:space="preserve">Python, Go, C, C++, SQL, JavaScript</w:t>
       </w:r>
     </w:p>
     <w:p>
@@ -208,7 +208,7 @@
           <w:sz w:val="20"/>
           <w:szCs w:val="20"/>
         </w:rPr>
-        <w:t xml:space="preserve">PyTorch, CUDA Kernels, Transformer Architectures, Multi-Agent Systems, LLM Tool-Use, Gemini API</w:t>
+        <w:t xml:space="preserve">PyTorch, Transformer Architectures, Multi-Agent Systems, LLM Tool-Use, Model Fine-Tuning, Gemini API</w:t>
       </w:r>
     </w:p>
     <w:p>
@@ -914,7 +914,7 @@
           <w:sz w:val="21"/>
           <w:szCs w:val="21"/>
         </w:rPr>
-        <w:t xml:space="preserve">Custom CUDA Kernels for Transformer Ops — with INT8 Quantization</w:t>
+        <w:t xml:space="preserve">Violent Crowd Behaviour Detection — C3D Video Classification (Published)</w:t>
       </w:r>
       <w:r>
         <w:rPr>
@@ -951,7 +951,7 @@
           <w:sz w:val="18"/>
           <w:szCs w:val="18"/>
         </w:rPr>
-        <w:t xml:space="preserve">C++, CUDA, Shared Memory Tiling, Flash Attention, INT8 Quantization, Nsight Compute, PyTorch C++ Extensions</w:t>
+        <w:t xml:space="preserve">Python, C3D, 3D CNN, Spatiotemporal Features, Video Classification, ViolentFlow Dataset</w:t>
       </w:r>
     </w:p>
     <w:p>
@@ -970,7 +970,7 @@
           <w:sz w:val="20"/>
           <w:szCs w:val="20"/>
         </w:rPr>
-        <w:t xml:space="preserve">Wrote custom CUDA kernels for core transformer operations—tiled matrix multiplication with shared memory, fused softmax, and a flash-attention-style fused QKV kernel—benchmarked against PyTorch and cuBLAS baselines.</w:t>
+        <w:t xml:space="preserve">Trained a C3D (3D convolutional) network on the ViolentFlow dataset to classify violent versus non-violent behaviour in crowd surveillance footage, learning spatiotemporal features directly from short video clips.</w:t>
       </w:r>
     </w:p>
     <w:p>
@@ -989,7 +989,7 @@
           <w:sz w:val="20"/>
           <w:szCs w:val="20"/>
         </w:rPr>
-        <w:t xml:space="preserve">Implemented INT8 quantized matrix multiplication kernels with dynamic per-channel scaling, achieving measurable speedups on consumer GPUs while maintaining acceptable accuracy degradation.</w:t>
+        <w:t xml:space="preserve">Built the video preprocessing pipeline—frame sampling, clip extraction, and normalization—and tuned the training setup to work with a limited set of labelled clips.</w:t>
       </w:r>
     </w:p>
     <w:p>
@@ -1008,7 +1008,7 @@
           <w:sz w:val="20"/>
           <w:szCs w:val="20"/>
         </w:rPr>
-        <w:t xml:space="preserve">Packaged kernels as a PyTorch C++ extension for drop-in use; profiled memory bandwidth, occupancy, and warp efficiency using Nsight Compute, documenting optimization decisions at each stage.</w:t>
+        <w:t xml:space="preserve">Evaluated classification performance on held-out footage and documented the methodology and results in a published research paper.</w:t>
       </w:r>
     </w:p>
     <w:p>

</xml_diff>

<commit_message>
Sync resume Word version with PDF updates
Drop the certification entry, add degree + year range to education, and
align the NeuroSync bullet with the other experience bullets.

Co-Authored-By: Claude Opus 4.8 <noreply@anthropic.com>
</commit_message>
<xml_diff>
--- a/assets/Himadri_S_Chatterjee_Resume.docx
+++ b/assets/Himadri_S_Chatterjee_Resume.docx
@@ -284,7 +284,7 @@
           <w:color w:val="1F2937"/>
           <w:sz w:val="16"/>
         </w:rPr>
-        <w:t>- Designed the payment architecture for Stripe subscriptions, usage metering, and secure checkout flows, supporting millions in transaction value.</w:t>
+        <w:t>- Designed the entire payment architecture for Stripe subscriptions, usage metering, and secure checkout flows, supporting millions in transaction value.</w:t>
       </w:r>
     </w:p>
     <w:p>
@@ -304,9 +304,15 @@
     </w:p>
     <w:p>
       <w:pPr>
-        <w:spacing w:after="0"/>
+        <w:spacing w:after="0" w:line="240" w:lineRule="auto"/>
+        <w:ind w:left="202" w:hanging="144"/>
       </w:pPr>
       <w:r>
+        <w:rPr>
+          <w:rFonts w:ascii="Arial" w:hAnsi="Arial"/>
+          <w:b w:val="0"/>
+          <w:sz w:val="16"/>
+        </w:rPr>
         <w:t>- Helped with data processing and training for the in-house NeuroSync model powering character facial expressions.</w:t>
       </w:r>
     </w:p>
@@ -490,11 +496,14 @@
           <w:color w:val="235C82"/>
           <w:sz w:val="18"/>
         </w:rPr>
-        <w:t>EDUCATION &amp; CERTIFICATION</w:t>
+        <w:t>EDUCATION</w:t>
       </w:r>
     </w:p>
     <w:p>
       <w:pPr>
+        <w:tabs>
+          <w:tab w:pos="10584" w:val="right"/>
+        </w:tabs>
         <w:spacing w:after="0" w:line="240" w:lineRule="auto"/>
       </w:pPr>
       <w:r>
@@ -504,19 +513,24 @@
           <w:color w:val="1F2937"/>
           <w:sz w:val="16"/>
         </w:rPr>
-        <w:t>Vellore Institute of Technology</w:t>
+        <w:t>Master of Computer Application - Vellore Institute of Technology</w:t>
       </w:r>
       <w:r>
         <w:rPr>
           <w:rFonts w:ascii="Arial" w:hAnsi="Arial"/>
-          <w:b w:val="0"/>
+          <w:b/>
           <w:color w:val="1F2937"/>
           <w:sz w:val="16"/>
         </w:rPr>
+        <w:tab/>
+        <w:t>2019 - 2021</w:t>
       </w:r>
     </w:p>
     <w:p>
       <w:pPr>
+        <w:tabs>
+          <w:tab w:pos="10584" w:val="right"/>
+        </w:tabs>
         <w:spacing w:after="0" w:line="240" w:lineRule="auto"/>
       </w:pPr>
       <w:r>
@@ -526,21 +540,8 @@
           <w:color w:val="1F2937"/>
           <w:sz w:val="16"/>
         </w:rPr>
-        <w:t>Ramakrishna Mission Residential College</w:t>
+        <w:t>BSc Computer Science - Ramakrishna Mission Residential College</w:t>
       </w:r>
-      <w:r>
-        <w:rPr>
-          <w:rFonts w:ascii="Arial" w:hAnsi="Arial"/>
-          <w:b w:val="0"/>
-          <w:color w:val="1F2937"/>
-          <w:sz w:val="16"/>
-        </w:rPr>
-      </w:r>
-    </w:p>
-    <w:p>
-      <w:pPr>
-        <w:spacing w:after="0" w:line="240" w:lineRule="auto"/>
-      </w:pPr>
       <w:r>
         <w:rPr>
           <w:rFonts w:ascii="Arial" w:hAnsi="Arial"/>
@@ -548,15 +549,8 @@
           <w:color w:val="1F2937"/>
           <w:sz w:val="16"/>
         </w:rPr>
-        <w:t>Google / Kaggle AI Agents Intensive</w:t>
-      </w:r>
-      <w:r>
-        <w:rPr>
-          <w:rFonts w:ascii="Arial" w:hAnsi="Arial"/>
-          <w:b w:val="0"/>
-          <w:color w:val="1F2937"/>
-          <w:sz w:val="16"/>
-        </w:rPr>
+        <w:tab/>
+        <w:t>2016 - 2019</w:t>
       </w:r>
     </w:p>
     <w:p>

</xml_diff>